<commit_message>
Se actualiza la documentación
</commit_message>
<xml_diff>
--- a/Documentacion/Diseño_ConsultarCuenta.docx
+++ b/Documentacion/Diseño_ConsultarCuenta.docx
@@ -722,9 +722,9 @@
           <w:noProof/>
         </w:rPr>
         <w:drawing>
-          <wp:inline distT="0" distB="0" distL="0" distR="0" wp14:anchorId="77AB6FED" wp14:editId="2E11B930">
-            <wp:extent cx="4619625" cy="1704975"/>
-            <wp:effectExtent l="0" t="0" r="9525" b="9525"/>
+          <wp:inline distT="0" distB="0" distL="0" distR="0" wp14:anchorId="59438E13" wp14:editId="39241E8F">
+            <wp:extent cx="5153025" cy="2019300"/>
+            <wp:effectExtent l="0" t="0" r="9525" b="0"/>
             <wp:docPr id="1" name="Imagen 1"/>
             <wp:cNvGraphicFramePr>
               <a:graphicFrameLocks xmlns:a="http://schemas.openxmlformats.org/drawingml/2006/main" noChangeAspect="1"/>
@@ -745,7 +745,7 @@
                   <pic:spPr>
                     <a:xfrm>
                       <a:off x="0" y="0"/>
-                      <a:ext cx="4619625" cy="1704975"/>
+                      <a:ext cx="5153025" cy="2019300"/>
                     </a:xfrm>
                     <a:prstGeom prst="rect">
                       <a:avLst/>
@@ -800,10 +800,10 @@
           <w:noProof/>
         </w:rPr>
         <w:drawing>
-          <wp:inline distT="0" distB="0" distL="0" distR="0" wp14:anchorId="43C8B934" wp14:editId="09B29337">
-            <wp:extent cx="4747294" cy="3781425"/>
-            <wp:effectExtent l="0" t="0" r="0" b="0"/>
-            <wp:docPr id="5" name="Imagen 5"/>
+          <wp:inline distT="0" distB="0" distL="0" distR="0" wp14:anchorId="5C900A95" wp14:editId="6EE4A087">
+            <wp:extent cx="5153025" cy="3829050"/>
+            <wp:effectExtent l="0" t="0" r="9525" b="0"/>
+            <wp:docPr id="9" name="Imagen 9"/>
             <wp:cNvGraphicFramePr>
               <a:graphicFrameLocks xmlns:a="http://schemas.openxmlformats.org/drawingml/2006/main" noChangeAspect="1"/>
             </wp:cNvGraphicFramePr>
@@ -823,7 +823,7 @@
                   <pic:spPr>
                     <a:xfrm>
                       <a:off x="0" y="0"/>
-                      <a:ext cx="4789495" cy="3815040"/>
+                      <a:ext cx="5153025" cy="3829050"/>
                     </a:xfrm>
                     <a:prstGeom prst="rect">
                       <a:avLst/>
@@ -844,16 +844,122 @@
           <w:lang w:val="es-MX"/>
         </w:rPr>
       </w:pPr>
+    </w:p>
+    <w:p>
+      <w:pPr>
+        <w:pStyle w:val="Prrafodelista"/>
+        <w:rPr>
+          <w:b/>
+          <w:lang w:val="es-MX"/>
+        </w:rPr>
+      </w:pPr>
+    </w:p>
+    <w:p>
+      <w:pPr>
+        <w:pStyle w:val="Prrafodelista"/>
+        <w:rPr>
+          <w:b/>
+          <w:lang w:val="es-MX"/>
+        </w:rPr>
+      </w:pPr>
+    </w:p>
+    <w:p>
+      <w:pPr>
+        <w:pStyle w:val="Prrafodelista"/>
+        <w:rPr>
+          <w:b/>
+          <w:lang w:val="es-MX"/>
+        </w:rPr>
+      </w:pPr>
+    </w:p>
+    <w:p>
+      <w:pPr>
+        <w:pStyle w:val="Prrafodelista"/>
+        <w:rPr>
+          <w:b/>
+          <w:lang w:val="es-MX"/>
+        </w:rPr>
+      </w:pPr>
+    </w:p>
+    <w:p>
+      <w:pPr>
+        <w:pStyle w:val="Prrafodelista"/>
+        <w:rPr>
+          <w:b/>
+          <w:lang w:val="es-MX"/>
+        </w:rPr>
+      </w:pPr>
+    </w:p>
+    <w:p>
+      <w:pPr>
+        <w:pStyle w:val="Prrafodelista"/>
+        <w:rPr>
+          <w:b/>
+          <w:lang w:val="es-MX"/>
+        </w:rPr>
+      </w:pPr>
+    </w:p>
+    <w:p>
+      <w:pPr>
+        <w:pStyle w:val="Prrafodelista"/>
+        <w:rPr>
+          <w:b/>
+          <w:lang w:val="es-MX"/>
+        </w:rPr>
+      </w:pPr>
+    </w:p>
+    <w:p>
+      <w:pPr>
+        <w:rPr>
+          <w:b/>
+          <w:lang w:val="es-MX"/>
+        </w:rPr>
+      </w:pPr>
+      <w:r>
+        <w:rPr>
+          <w:b/>
+          <w:lang w:val="es-MX"/>
+        </w:rPr>
+        <w:t>Procesos exitosos</w:t>
+      </w:r>
+    </w:p>
+    <w:p>
+      <w:pPr>
+        <w:pStyle w:val="Prrafodelista"/>
+        <w:numPr>
+          <w:ilvl w:val="0"/>
+          <w:numId w:val="1"/>
+        </w:numPr>
+        <w:rPr>
+          <w:b/>
+          <w:lang w:val="es-MX"/>
+        </w:rPr>
+      </w:pPr>
+      <w:r>
+        <w:rPr>
+          <w:b/>
+          <w:lang w:val="es-MX"/>
+        </w:rPr>
+        <w:t>Consulta de cuenta</w:t>
+      </w:r>
+    </w:p>
+    <w:p>
+      <w:pPr>
+        <w:ind w:left="360"/>
+        <w:rPr>
+          <w:b/>
+          <w:lang w:val="es-MX"/>
+        </w:rPr>
+      </w:pPr>
       <w:r>
         <w:rPr>
           <w:noProof/>
         </w:rPr>
-        <w:lastRenderedPageBreak/>
         <w:drawing>
-          <wp:inline distT="0" distB="0" distL="0" distR="0" wp14:anchorId="574F23D7" wp14:editId="4199E2E3">
-            <wp:extent cx="5162550" cy="3771900"/>
-            <wp:effectExtent l="0" t="0" r="0" b="0"/>
-            <wp:docPr id="7" name="Imagen 7"/>
+          <wp:inline distT="0" distB="0" distL="0" distR="0" wp14:anchorId="7D694053" wp14:editId="73588D02">
+            <wp:extent cx="5612130" cy="2069465"/>
+            <wp:effectExtent l="0" t="0" r="7620" b="6985"/>
+            <wp:docPr id="8" name="Imagen 8"/>
             <wp:cNvGraphicFramePr>
               <a:graphicFrameLocks xmlns:a="http://schemas.openxmlformats.org/drawingml/2006/main" noChangeAspect="1"/>
             </wp:cNvGraphicFramePr>
@@ -873,7 +979,7 @@
                   <pic:spPr>
                     <a:xfrm>
                       <a:off x="0" y="0"/>
-                      <a:ext cx="5162550" cy="3771900"/>
+                      <a:ext cx="5612130" cy="2069465"/>
                     </a:xfrm>
                     <a:prstGeom prst="rect">
                       <a:avLst/>
@@ -898,30 +1004,6 @@
     <w:p>
       <w:pPr>
         <w:pStyle w:val="Prrafodelista"/>
-        <w:rPr>
-          <w:b/>
-          <w:lang w:val="es-MX"/>
-        </w:rPr>
-      </w:pPr>
-    </w:p>
-    <w:p>
-      <w:pPr>
-        <w:rPr>
-          <w:b/>
-          <w:lang w:val="es-MX"/>
-        </w:rPr>
-      </w:pPr>
-      <w:r>
-        <w:rPr>
-          <w:b/>
-          <w:lang w:val="es-MX"/>
-        </w:rPr>
-        <w:t>Procesos exitosos</w:t>
-      </w:r>
-    </w:p>
-    <w:p>
-      <w:pPr>
-        <w:pStyle w:val="Prrafodelista"/>
         <w:numPr>
           <w:ilvl w:val="0"/>
           <w:numId w:val="1"/>
@@ -936,8 +1018,24 @@
           <w:b/>
           <w:lang w:val="es-MX"/>
         </w:rPr>
-        <w:t>Consulta de cuenta</w:t>
-      </w:r>
+        <w:t xml:space="preserve"> </w:t>
+      </w:r>
+      <w:r>
+        <w:rPr>
+          <w:b/>
+          <w:lang w:val="es-MX"/>
+        </w:rPr>
+        <w:t>Retiro de dinero</w:t>
+      </w:r>
+    </w:p>
+    <w:p>
+      <w:pPr>
+        <w:pStyle w:val="Prrafodelista"/>
+        <w:rPr>
+          <w:b/>
+          <w:lang w:val="es-MX"/>
+        </w:rPr>
+      </w:pPr>
     </w:p>
     <w:p>
       <w:pPr>
@@ -952,10 +1050,10 @@
           <w:noProof/>
         </w:rPr>
         <w:drawing>
-          <wp:inline distT="0" distB="0" distL="0" distR="0" wp14:anchorId="09D1C629" wp14:editId="444E4EBA">
-            <wp:extent cx="4438650" cy="3057525"/>
+          <wp:inline distT="0" distB="0" distL="0" distR="0" wp14:anchorId="244BBF9A" wp14:editId="593A4744">
+            <wp:extent cx="5143500" cy="3762375"/>
             <wp:effectExtent l="0" t="0" r="0" b="9525"/>
-            <wp:docPr id="3" name="Imagen 3"/>
+            <wp:docPr id="10" name="Imagen 10"/>
             <wp:cNvGraphicFramePr>
               <a:graphicFrameLocks xmlns:a="http://schemas.openxmlformats.org/drawingml/2006/main" noChangeAspect="1"/>
             </wp:cNvGraphicFramePr>
@@ -975,7 +1073,7 @@
                   <pic:spPr>
                     <a:xfrm>
                       <a:off x="0" y="0"/>
-                      <a:ext cx="4438650" cy="3057525"/>
+                      <a:ext cx="5143500" cy="3762375"/>
                     </a:xfrm>
                     <a:prstGeom prst="rect">
                       <a:avLst/>
@@ -990,407 +1088,363 @@
     </w:p>
     <w:p>
       <w:pPr>
-        <w:pStyle w:val="Prrafodelista"/>
-        <w:rPr>
-          <w:b/>
-          <w:lang w:val="es-MX"/>
-        </w:rPr>
-      </w:pPr>
-    </w:p>
-    <w:p>
-      <w:pPr>
-        <w:pStyle w:val="Prrafodelista"/>
-        <w:rPr>
-          <w:b/>
-          <w:lang w:val="es-MX"/>
-        </w:rPr>
-      </w:pPr>
-      <w:r>
-        <w:rPr>
-          <w:noProof/>
+        <w:rPr>
+          <w:b/>
+          <w:lang w:val="es-MX"/>
+        </w:rPr>
+      </w:pPr>
+    </w:p>
+    <w:p>
+      <w:pPr>
+        <w:rPr>
+          <w:b/>
+          <w:lang w:val="es-MX"/>
+        </w:rPr>
+      </w:pPr>
+      <w:bookmarkStart w:id="0" w:name="_GoBack"/>
+      <w:bookmarkEnd w:id="0"/>
+    </w:p>
+    <w:p>
+      <w:pPr>
+        <w:rPr>
+          <w:b/>
+          <w:lang w:val="es-MX"/>
+        </w:rPr>
+      </w:pPr>
+      <w:r>
+        <w:rPr>
+          <w:b/>
+          <w:lang w:val="es-MX"/>
         </w:rPr>
         <w:lastRenderedPageBreak/>
-        <w:drawing>
-          <wp:inline distT="0" distB="0" distL="0" distR="0" wp14:anchorId="21804EAC" wp14:editId="6BFE2DCA">
-            <wp:extent cx="5391150" cy="3486150"/>
-            <wp:effectExtent l="0" t="0" r="0" b="0"/>
-            <wp:docPr id="6" name="Imagen 6"/>
-            <wp:cNvGraphicFramePr>
-              <a:graphicFrameLocks xmlns:a="http://schemas.openxmlformats.org/drawingml/2006/main" noChangeAspect="1"/>
-            </wp:cNvGraphicFramePr>
-            <a:graphic xmlns:a="http://schemas.openxmlformats.org/drawingml/2006/main">
-              <a:graphicData uri="http://schemas.openxmlformats.org/drawingml/2006/picture">
-                <pic:pic xmlns:pic="http://schemas.openxmlformats.org/drawingml/2006/picture">
-                  <pic:nvPicPr>
-                    <pic:cNvPr id="1" name=""/>
-                    <pic:cNvPicPr/>
-                  </pic:nvPicPr>
-                  <pic:blipFill>
-                    <a:blip r:embed="rId9"/>
-                    <a:stretch>
-                      <a:fillRect/>
-                    </a:stretch>
-                  </pic:blipFill>
-                  <pic:spPr>
-                    <a:xfrm>
-                      <a:off x="0" y="0"/>
-                      <a:ext cx="5391150" cy="3486150"/>
-                    </a:xfrm>
-                    <a:prstGeom prst="rect">
-                      <a:avLst/>
-                    </a:prstGeom>
-                  </pic:spPr>
-                </pic:pic>
-              </a:graphicData>
-            </a:graphic>
-          </wp:inline>
-        </w:drawing>
-      </w:r>
-    </w:p>
-    <w:p>
-      <w:pPr>
-        <w:pStyle w:val="Prrafodelista"/>
-        <w:rPr>
-          <w:b/>
-          <w:lang w:val="es-MX"/>
-        </w:rPr>
-      </w:pPr>
-    </w:p>
-    <w:p>
-      <w:pPr>
-        <w:pStyle w:val="Prrafodelista"/>
-        <w:numPr>
-          <w:ilvl w:val="0"/>
-          <w:numId w:val="1"/>
-        </w:numPr>
-        <w:rPr>
-          <w:b/>
-          <w:lang w:val="es-MX"/>
-        </w:rPr>
-      </w:pPr>
-      <w:r>
-        <w:rPr>
-          <w:b/>
+        <w:t xml:space="preserve">¿Cómo funciona el flujo </w:t>
+      </w:r>
+      <w:proofErr w:type="spellStart"/>
+      <w:r>
+        <w:rPr>
+          <w:b/>
+          <w:lang w:val="es-MX"/>
+        </w:rPr>
+        <w:t>batch</w:t>
+      </w:r>
+      <w:proofErr w:type="spellEnd"/>
+      <w:r>
+        <w:rPr>
+          <w:b/>
+          <w:lang w:val="es-MX"/>
+        </w:rPr>
+        <w:t>?</w:t>
+      </w:r>
+    </w:p>
+    <w:p>
+      <w:pPr>
+        <w:rPr>
+          <w:lang w:val="es-MX"/>
+        </w:rPr>
+      </w:pPr>
+      <w:proofErr w:type="gramStart"/>
+      <w:r>
+        <w:rPr>
+          <w:lang w:val="es-MX"/>
+        </w:rPr>
+        <w:t>Todo</w:t>
+      </w:r>
+      <w:r>
+        <w:rPr>
+          <w:lang w:val="es-MX"/>
+        </w:rPr>
+        <w:t xml:space="preserve"> gira</w:t>
+      </w:r>
+      <w:proofErr w:type="gramEnd"/>
+      <w:r>
+        <w:rPr>
+          <w:lang w:val="es-MX"/>
+        </w:rPr>
+        <w:t xml:space="preserve"> en </w:t>
+      </w:r>
+      <w:r>
+        <w:rPr>
+          <w:lang w:val="es-MX"/>
+        </w:rPr>
+        <w:t>torno</w:t>
+      </w:r>
+      <w:r>
+        <w:rPr>
           <w:lang w:val="es-MX"/>
         </w:rPr>
         <w:t xml:space="preserve"> </w:t>
       </w:r>
       <w:r>
         <w:rPr>
-          <w:b/>
-          <w:lang w:val="es-MX"/>
-        </w:rPr>
-        <w:t>Retiro de dinero</w:t>
-      </w:r>
-    </w:p>
-    <w:p>
-      <w:pPr>
-        <w:pStyle w:val="Prrafodelista"/>
-        <w:rPr>
-          <w:b/>
-          <w:lang w:val="es-MX"/>
-        </w:rPr>
-      </w:pPr>
-      <w:r>
-        <w:rPr>
-          <w:noProof/>
-        </w:rPr>
-        <w:drawing>
-          <wp:inline distT="0" distB="0" distL="0" distR="0" wp14:anchorId="07F85181" wp14:editId="109F7286">
-            <wp:extent cx="4381500" cy="3305175"/>
-            <wp:effectExtent l="0" t="0" r="0" b="9525"/>
-            <wp:docPr id="4" name="Imagen 4"/>
-            <wp:cNvGraphicFramePr>
-              <a:graphicFrameLocks xmlns:a="http://schemas.openxmlformats.org/drawingml/2006/main" noChangeAspect="1"/>
-            </wp:cNvGraphicFramePr>
-            <a:graphic xmlns:a="http://schemas.openxmlformats.org/drawingml/2006/main">
-              <a:graphicData uri="http://schemas.openxmlformats.org/drawingml/2006/picture">
-                <pic:pic xmlns:pic="http://schemas.openxmlformats.org/drawingml/2006/picture">
-                  <pic:nvPicPr>
-                    <pic:cNvPr id="1" name=""/>
-                    <pic:cNvPicPr/>
-                  </pic:nvPicPr>
-                  <pic:blipFill>
-                    <a:blip r:embed="rId10"/>
-                    <a:stretch>
-                      <a:fillRect/>
-                    </a:stretch>
-                  </pic:blipFill>
-                  <pic:spPr>
-                    <a:xfrm>
-                      <a:off x="0" y="0"/>
-                      <a:ext cx="4381500" cy="3305175"/>
-                    </a:xfrm>
-                    <a:prstGeom prst="rect">
-                      <a:avLst/>
-                    </a:prstGeom>
-                  </pic:spPr>
-                </pic:pic>
-              </a:graphicData>
-            </a:graphic>
-          </wp:inline>
-        </w:drawing>
-      </w:r>
-    </w:p>
-    <w:p>
-      <w:pPr>
-        <w:pStyle w:val="Prrafodelista"/>
-        <w:rPr>
-          <w:b/>
-          <w:lang w:val="es-MX"/>
-        </w:rPr>
-      </w:pPr>
-      <w:r>
-        <w:rPr>
-          <w:noProof/>
-        </w:rPr>
-        <w:lastRenderedPageBreak/>
-        <w:drawing>
-          <wp:inline distT="0" distB="0" distL="0" distR="0" wp14:anchorId="0BD99253" wp14:editId="34CF3C2A">
-            <wp:extent cx="5076825" cy="3600450"/>
-            <wp:effectExtent l="0" t="0" r="9525" b="0"/>
-            <wp:docPr id="2" name="Imagen 2"/>
-            <wp:cNvGraphicFramePr>
-              <a:graphicFrameLocks xmlns:a="http://schemas.openxmlformats.org/drawingml/2006/main" noChangeAspect="1"/>
-            </wp:cNvGraphicFramePr>
-            <a:graphic xmlns:a="http://schemas.openxmlformats.org/drawingml/2006/main">
-              <a:graphicData uri="http://schemas.openxmlformats.org/drawingml/2006/picture">
-                <pic:pic xmlns:pic="http://schemas.openxmlformats.org/drawingml/2006/picture">
-                  <pic:nvPicPr>
-                    <pic:cNvPr id="1" name=""/>
-                    <pic:cNvPicPr/>
-                  </pic:nvPicPr>
-                  <pic:blipFill>
-                    <a:blip r:embed="rId11"/>
-                    <a:stretch>
-                      <a:fillRect/>
-                    </a:stretch>
-                  </pic:blipFill>
-                  <pic:spPr>
-                    <a:xfrm>
-                      <a:off x="0" y="0"/>
-                      <a:ext cx="5076825" cy="3600450"/>
-                    </a:xfrm>
-                    <a:prstGeom prst="rect">
-                      <a:avLst/>
-                    </a:prstGeom>
-                  </pic:spPr>
-                </pic:pic>
-              </a:graphicData>
-            </a:graphic>
-          </wp:inline>
-        </w:drawing>
-      </w:r>
-    </w:p>
-    <w:p>
-      <w:pPr>
-        <w:pStyle w:val="Prrafodelista"/>
-        <w:rPr>
-          <w:b/>
-          <w:lang w:val="es-MX"/>
-        </w:rPr>
-      </w:pPr>
-    </w:p>
-    <w:p>
-      <w:pPr>
-        <w:pStyle w:val="Prrafodelista"/>
-        <w:rPr>
-          <w:b/>
-          <w:lang w:val="es-MX"/>
-        </w:rPr>
-      </w:pPr>
-    </w:p>
-    <w:p>
-      <w:pPr>
-        <w:pStyle w:val="Prrafodelista"/>
-        <w:rPr>
-          <w:b/>
-          <w:lang w:val="es-MX"/>
-        </w:rPr>
-      </w:pPr>
-    </w:p>
-    <w:p>
-      <w:pPr>
-        <w:pStyle w:val="Prrafodelista"/>
-        <w:rPr>
-          <w:b/>
-          <w:lang w:val="es-MX"/>
-        </w:rPr>
-      </w:pPr>
-    </w:p>
-    <w:p>
-      <w:pPr>
-        <w:pStyle w:val="Prrafodelista"/>
-        <w:rPr>
-          <w:b/>
-          <w:lang w:val="es-MX"/>
-        </w:rPr>
-      </w:pPr>
-    </w:p>
-    <w:p>
-      <w:pPr>
-        <w:rPr>
-          <w:b/>
-          <w:lang w:val="es-MX"/>
-        </w:rPr>
-      </w:pPr>
-      <w:r>
-        <w:rPr>
-          <w:b/>
-          <w:lang w:val="es-MX"/>
-        </w:rPr>
-        <w:t xml:space="preserve">¿Cómo funciona el flujo </w:t>
+          <w:lang w:val="es-MX"/>
+        </w:rPr>
+        <w:t xml:space="preserve">a </w:t>
+      </w:r>
+      <w:r>
+        <w:rPr>
+          <w:lang w:val="es-MX"/>
+        </w:rPr>
+        <w:t xml:space="preserve">las herramientas laborales que tenga la empresa. Desde el desarrollo del programa </w:t>
+      </w:r>
+      <w:r>
+        <w:rPr>
+          <w:lang w:val="es-MX"/>
+        </w:rPr>
+        <w:t>COBOL que realiza</w:t>
+      </w:r>
+      <w:r>
+        <w:rPr>
+          <w:lang w:val="es-MX"/>
+        </w:rPr>
+        <w:t xml:space="preserve"> procesos</w:t>
+      </w:r>
+      <w:r>
+        <w:rPr>
+          <w:lang w:val="es-MX"/>
+        </w:rPr>
+        <w:t xml:space="preserve"> hasta la </w:t>
+      </w:r>
+      <w:r>
+        <w:rPr>
+          <w:lang w:val="es-MX"/>
+        </w:rPr>
+        <w:t>ejecución automática por medio de cron</w:t>
+      </w:r>
+      <w:r>
+        <w:rPr>
+          <w:lang w:val="es-MX"/>
+        </w:rPr>
+        <w:t xml:space="preserve"> o temas más especializados como CONTROL-M o </w:t>
+      </w:r>
+      <w:r>
+        <w:rPr>
+          <w:lang w:val="es-MX"/>
+        </w:rPr>
+        <w:t xml:space="preserve">con </w:t>
+      </w:r>
+      <w:r>
+        <w:rPr>
+          <w:lang w:val="es-MX"/>
+        </w:rPr>
+        <w:t xml:space="preserve">JCL con el fin de </w:t>
+      </w:r>
+      <w:r>
+        <w:rPr>
+          <w:lang w:val="es-MX"/>
+        </w:rPr>
+        <w:t xml:space="preserve">obtener un </w:t>
       </w:r>
       <w:proofErr w:type="spellStart"/>
       <w:r>
         <w:rPr>
-          <w:b/>
-          <w:lang w:val="es-MX"/>
-        </w:rPr>
-        <w:t>batch</w:t>
+          <w:lang w:val="es-MX"/>
+        </w:rPr>
+        <w:t>Return</w:t>
       </w:r>
       <w:proofErr w:type="spellEnd"/>
       <w:r>
         <w:rPr>
-          <w:b/>
-          <w:lang w:val="es-MX"/>
-        </w:rPr>
-        <w:t>?</w:t>
-      </w:r>
-    </w:p>
-    <w:p>
-      <w:pPr>
-        <w:rPr>
-          <w:lang w:val="es-MX"/>
-        </w:rPr>
-      </w:pPr>
-      <w:bookmarkStart w:id="0" w:name="_GoBack"/>
-      <w:proofErr w:type="gramStart"/>
-      <w:r>
-        <w:rPr>
-          <w:lang w:val="es-MX"/>
-        </w:rPr>
-        <w:t>Todo</w:t>
-      </w:r>
-      <w:r>
-        <w:rPr>
-          <w:lang w:val="es-MX"/>
-        </w:rPr>
-        <w:t xml:space="preserve"> gira</w:t>
-      </w:r>
-      <w:proofErr w:type="gramEnd"/>
-      <w:r>
-        <w:rPr>
-          <w:lang w:val="es-MX"/>
-        </w:rPr>
-        <w:t xml:space="preserve"> en </w:t>
-      </w:r>
-      <w:r>
-        <w:rPr>
-          <w:lang w:val="es-MX"/>
-        </w:rPr>
-        <w:t>torno</w:t>
-      </w:r>
-      <w:r>
-        <w:rPr>
           <w:lang w:val="es-MX"/>
         </w:rPr>
         <w:t xml:space="preserve"> </w:t>
       </w:r>
-      <w:bookmarkEnd w:id="0"/>
-      <w:r>
-        <w:rPr>
-          <w:lang w:val="es-MX"/>
-        </w:rPr>
-        <w:t xml:space="preserve">a </w:t>
-      </w:r>
-      <w:r>
-        <w:rPr>
-          <w:lang w:val="es-MX"/>
-        </w:rPr>
-        <w:t xml:space="preserve">las herramientas laborales que tenga la empresa. Desde el desarrollo del programa </w:t>
-      </w:r>
-      <w:r>
-        <w:rPr>
-          <w:lang w:val="es-MX"/>
-        </w:rPr>
-        <w:t>COBOL que realiza</w:t>
-      </w:r>
-      <w:r>
-        <w:rPr>
-          <w:lang w:val="es-MX"/>
-        </w:rPr>
-        <w:t xml:space="preserve"> procesos</w:t>
-      </w:r>
-      <w:r>
-        <w:rPr>
-          <w:lang w:val="es-MX"/>
-        </w:rPr>
-        <w:t xml:space="preserve"> hasta la </w:t>
-      </w:r>
-      <w:r>
-        <w:rPr>
-          <w:lang w:val="es-MX"/>
-        </w:rPr>
-        <w:t>ejecución automática por medio de cron</w:t>
-      </w:r>
-      <w:r>
-        <w:rPr>
-          <w:lang w:val="es-MX"/>
-        </w:rPr>
-        <w:t xml:space="preserve"> o temas más especializados como CONTROL-M o </w:t>
-      </w:r>
-      <w:r>
-        <w:rPr>
-          <w:lang w:val="es-MX"/>
-        </w:rPr>
-        <w:t xml:space="preserve">con </w:t>
-      </w:r>
-      <w:r>
-        <w:rPr>
-          <w:lang w:val="es-MX"/>
-        </w:rPr>
-        <w:t xml:space="preserve">JCL con el fin de </w:t>
-      </w:r>
-      <w:r>
-        <w:rPr>
-          <w:lang w:val="es-MX"/>
-        </w:rPr>
-        <w:t xml:space="preserve">obtener un </w:t>
-      </w:r>
       <w:proofErr w:type="spellStart"/>
       <w:r>
         <w:rPr>
           <w:lang w:val="es-MX"/>
         </w:rPr>
-        <w:t>Return</w:t>
+        <w:t>Code</w:t>
       </w:r>
       <w:proofErr w:type="spellEnd"/>
       <w:r>
         <w:rPr>
           <w:lang w:val="es-MX"/>
         </w:rPr>
-        <w:t xml:space="preserve"> </w:t>
+        <w:t xml:space="preserve"> igual a</w:t>
+      </w:r>
+      <w:r>
+        <w:rPr>
+          <w:lang w:val="es-MX"/>
+        </w:rPr>
+        <w:t xml:space="preserve"> cero</w:t>
+      </w:r>
+      <w:r>
+        <w:rPr>
+          <w:lang w:val="es-MX"/>
+        </w:rPr>
+        <w:t>.</w:t>
+      </w:r>
+    </w:p>
+    <w:p>
+      <w:pPr>
+        <w:rPr>
+          <w:b/>
+          <w:lang w:val="es-MX"/>
+        </w:rPr>
+      </w:pPr>
+      <w:r>
+        <w:rPr>
+          <w:b/>
+          <w:lang w:val="es-MX"/>
+        </w:rPr>
+        <w:t>¿Cómo se integra COBOL con JCL?</w:t>
+      </w:r>
+    </w:p>
+    <w:p>
+      <w:pPr>
+        <w:rPr>
+          <w:lang w:val="es-MX"/>
+        </w:rPr>
+      </w:pPr>
+      <w:r>
+        <w:rPr>
+          <w:lang w:val="es-MX"/>
+        </w:rPr>
+        <w:t>JCL es el encargado de los recursos en la ejecución de un proceso,</w:t>
+      </w:r>
+      <w:r>
+        <w:rPr>
+          <w:lang w:val="es-MX"/>
+        </w:rPr>
+        <w:t xml:space="preserve"> como archivos a trabajar o programas,</w:t>
+      </w:r>
+      <w:r>
+        <w:rPr>
+          <w:lang w:val="es-MX"/>
+        </w:rPr>
+        <w:t xml:space="preserve"> mientras que cobol contiene toda la lógica del proceso. Su manera de integración va con la coincidencia en nombres de archivos o demás elementos importantes</w:t>
+      </w:r>
+      <w:r>
+        <w:rPr>
+          <w:lang w:val="es-MX"/>
+        </w:rPr>
+        <w:t xml:space="preserve"> que se necesitan para que la ejecución sea un éxito</w:t>
+      </w:r>
+      <w:r>
+        <w:rPr>
+          <w:lang w:val="es-MX"/>
+        </w:rPr>
+        <w:t>.</w:t>
+      </w:r>
+    </w:p>
+    <w:p>
+      <w:pPr>
+        <w:rPr>
+          <w:b/>
+          <w:lang w:val="es-MX"/>
+        </w:rPr>
+      </w:pPr>
+      <w:r>
+        <w:rPr>
+          <w:b/>
+          <w:lang w:val="es-MX"/>
+        </w:rPr>
+        <w:t>¿Cómo funcionaría en producción?</w:t>
+      </w:r>
+    </w:p>
+    <w:p>
+      <w:pPr>
+        <w:rPr>
+          <w:lang w:val="es-MX"/>
+        </w:rPr>
+      </w:pPr>
+      <w:r>
+        <w:rPr>
+          <w:lang w:val="es-MX"/>
+        </w:rPr>
+        <w:t>La</w:t>
+      </w:r>
+      <w:r>
+        <w:rPr>
+          <w:lang w:val="es-MX"/>
+        </w:rPr>
+        <w:t xml:space="preserve"> mayoría de los procesos en producción son automatizados y controlados. </w:t>
+      </w:r>
+      <w:r>
+        <w:rPr>
+          <w:lang w:val="es-MX"/>
+        </w:rPr>
+        <w:t>El flujo de trabajo i</w:t>
+      </w:r>
+      <w:r>
+        <w:rPr>
+          <w:lang w:val="es-MX"/>
+        </w:rPr>
+        <w:t xml:space="preserve">nicia </w:t>
+      </w:r>
+      <w:r>
+        <w:rPr>
+          <w:lang w:val="es-MX"/>
+        </w:rPr>
+        <w:t>cuando</w:t>
+      </w:r>
+      <w:r>
+        <w:rPr>
+          <w:lang w:val="es-MX"/>
+        </w:rPr>
+        <w:t xml:space="preserve"> CONTROL-M </w:t>
+      </w:r>
+      <w:r>
+        <w:rPr>
+          <w:lang w:val="es-MX"/>
+        </w:rPr>
+        <w:t xml:space="preserve">lanza el </w:t>
       </w:r>
       <w:proofErr w:type="spellStart"/>
       <w:r>
         <w:rPr>
           <w:lang w:val="es-MX"/>
         </w:rPr>
-        <w:t>Code</w:t>
+        <w:t>job</w:t>
       </w:r>
       <w:proofErr w:type="spellEnd"/>
       <w:r>
         <w:rPr>
           <w:lang w:val="es-MX"/>
         </w:rPr>
-        <w:t xml:space="preserve"> igual a</w:t>
-      </w:r>
-      <w:r>
-        <w:rPr>
-          <w:lang w:val="es-MX"/>
-        </w:rPr>
-        <w:t xml:space="preserve"> cero</w:t>
+        <w:t xml:space="preserve"> para </w:t>
+      </w:r>
+      <w:r>
+        <w:rPr>
+          <w:lang w:val="es-MX"/>
+        </w:rPr>
+        <w:t>realizar</w:t>
+      </w:r>
+      <w:r>
+        <w:rPr>
+          <w:lang w:val="es-MX"/>
+        </w:rPr>
+        <w:t xml:space="preserve"> el proceso</w:t>
+      </w:r>
+      <w:r>
+        <w:rPr>
+          <w:lang w:val="es-MX"/>
+        </w:rPr>
+        <w:t xml:space="preserve"> mientras</w:t>
+      </w:r>
+      <w:r>
+        <w:rPr>
+          <w:lang w:val="es-MX"/>
+        </w:rPr>
+        <w:t xml:space="preserve"> el equipo de operaciones o infraestructura monitorea lo que sucede </w:t>
+      </w:r>
+      <w:r>
+        <w:rPr>
+          <w:lang w:val="es-MX"/>
+        </w:rPr>
+        <w:t>en la ejecución</w:t>
+      </w:r>
+      <w:r>
+        <w:rPr>
+          <w:lang w:val="es-MX"/>
+        </w:rPr>
+        <w:t xml:space="preserve"> y el resultado </w:t>
+      </w:r>
+      <w:r>
+        <w:rPr>
+          <w:lang w:val="es-MX"/>
+        </w:rPr>
+        <w:t>final que indica si el proceso finalizó exitosamente</w:t>
       </w:r>
       <w:r>
         <w:rPr>
@@ -1411,197 +1465,19 @@
           <w:b/>
           <w:lang w:val="es-MX"/>
         </w:rPr>
-        <w:t>¿Cómo se integra COBOL con JCL?</w:t>
-      </w:r>
-    </w:p>
-    <w:p>
-      <w:pPr>
-        <w:rPr>
-          <w:lang w:val="es-MX"/>
-        </w:rPr>
-      </w:pPr>
-      <w:r>
-        <w:rPr>
-          <w:lang w:val="es-MX"/>
-        </w:rPr>
-        <w:t>JCL es el encargado de los recursos en la ejecución de un proceso,</w:t>
-      </w:r>
-      <w:r>
-        <w:rPr>
-          <w:lang w:val="es-MX"/>
-        </w:rPr>
-        <w:t xml:space="preserve"> como archivos a trabajar o programas,</w:t>
-      </w:r>
-      <w:r>
-        <w:rPr>
-          <w:lang w:val="es-MX"/>
-        </w:rPr>
-        <w:t xml:space="preserve"> mientras que cobol contiene toda la lógica del proceso. Su manera de integración va con la coincidencia en nombres de archivos o demás elementos importantes</w:t>
-      </w:r>
-      <w:r>
-        <w:rPr>
-          <w:lang w:val="es-MX"/>
-        </w:rPr>
-        <w:t xml:space="preserve"> que se necesitan para que la ejecución sea un éxito</w:t>
-      </w:r>
-      <w:r>
-        <w:rPr>
-          <w:lang w:val="es-MX"/>
-        </w:rPr>
-        <w:t>.</w:t>
-      </w:r>
-    </w:p>
-    <w:p>
-      <w:pPr>
-        <w:rPr>
-          <w:b/>
-          <w:lang w:val="es-MX"/>
-        </w:rPr>
-      </w:pPr>
-      <w:r>
-        <w:rPr>
-          <w:b/>
-          <w:lang w:val="es-MX"/>
-        </w:rPr>
-        <w:t>¿Cómo funcionaría en producción?</w:t>
-      </w:r>
-    </w:p>
-    <w:p>
-      <w:pPr>
-        <w:rPr>
-          <w:lang w:val="es-MX"/>
-        </w:rPr>
-      </w:pPr>
-      <w:r>
-        <w:rPr>
-          <w:lang w:val="es-MX"/>
-        </w:rPr>
-        <w:t>La</w:t>
-      </w:r>
-      <w:r>
-        <w:rPr>
-          <w:lang w:val="es-MX"/>
-        </w:rPr>
-        <w:t xml:space="preserve"> mayoría de los procesos en producción son automatizados y controlados. </w:t>
-      </w:r>
-      <w:r>
-        <w:rPr>
-          <w:lang w:val="es-MX"/>
-        </w:rPr>
-        <w:t>El flujo de trabajo i</w:t>
-      </w:r>
-      <w:r>
-        <w:rPr>
-          <w:lang w:val="es-MX"/>
-        </w:rPr>
-        <w:t xml:space="preserve">nicia </w:t>
-      </w:r>
-      <w:r>
-        <w:rPr>
-          <w:lang w:val="es-MX"/>
-        </w:rPr>
-        <w:t>cuando</w:t>
-      </w:r>
-      <w:r>
-        <w:rPr>
-          <w:lang w:val="es-MX"/>
-        </w:rPr>
-        <w:t xml:space="preserve"> CONTROL-M </w:t>
-      </w:r>
-      <w:r>
-        <w:rPr>
-          <w:lang w:val="es-MX"/>
-        </w:rPr>
-        <w:t xml:space="preserve">lanza el </w:t>
+        <w:t xml:space="preserve">Diferencia entre </w:t>
       </w:r>
       <w:proofErr w:type="spellStart"/>
       <w:r>
         <w:rPr>
-          <w:lang w:val="es-MX"/>
-        </w:rPr>
-        <w:t>job</w:t>
+          <w:b/>
+          <w:lang w:val="es-MX"/>
+        </w:rPr>
+        <w:t>Batch</w:t>
       </w:r>
       <w:proofErr w:type="spellEnd"/>
       <w:r>
         <w:rPr>
-          <w:lang w:val="es-MX"/>
-        </w:rPr>
-        <w:t xml:space="preserve"> para </w:t>
-      </w:r>
-      <w:r>
-        <w:rPr>
-          <w:lang w:val="es-MX"/>
-        </w:rPr>
-        <w:t>realizar</w:t>
-      </w:r>
-      <w:r>
-        <w:rPr>
-          <w:lang w:val="es-MX"/>
-        </w:rPr>
-        <w:t xml:space="preserve"> el proceso</w:t>
-      </w:r>
-      <w:r>
-        <w:rPr>
-          <w:lang w:val="es-MX"/>
-        </w:rPr>
-        <w:t xml:space="preserve"> mientras</w:t>
-      </w:r>
-      <w:r>
-        <w:rPr>
-          <w:lang w:val="es-MX"/>
-        </w:rPr>
-        <w:t xml:space="preserve"> el equipo de operaciones o infraestructura monitorea lo que sucede </w:t>
-      </w:r>
-      <w:r>
-        <w:rPr>
-          <w:lang w:val="es-MX"/>
-        </w:rPr>
-        <w:t>en la ejecución</w:t>
-      </w:r>
-      <w:r>
-        <w:rPr>
-          <w:lang w:val="es-MX"/>
-        </w:rPr>
-        <w:t xml:space="preserve"> y el resultado </w:t>
-      </w:r>
-      <w:r>
-        <w:rPr>
-          <w:lang w:val="es-MX"/>
-        </w:rPr>
-        <w:t>final que indica si el proceso finalizó exitosamente</w:t>
-      </w:r>
-      <w:r>
-        <w:rPr>
-          <w:lang w:val="es-MX"/>
-        </w:rPr>
-        <w:t>.</w:t>
-      </w:r>
-    </w:p>
-    <w:p>
-      <w:pPr>
-        <w:rPr>
-          <w:b/>
-          <w:lang w:val="es-MX"/>
-        </w:rPr>
-      </w:pPr>
-      <w:r>
-        <w:rPr>
-          <w:b/>
-          <w:lang w:val="es-MX"/>
-        </w:rPr>
-        <w:t xml:space="preserve">Diferencia entre </w:t>
-      </w:r>
-      <w:proofErr w:type="spellStart"/>
-      <w:r>
-        <w:rPr>
-          <w:b/>
-          <w:lang w:val="es-MX"/>
-        </w:rPr>
-        <w:t>Batch</w:t>
-      </w:r>
-      <w:proofErr w:type="spellEnd"/>
-      <w:r>
-        <w:rPr>
           <w:b/>
           <w:lang w:val="es-MX"/>
         </w:rPr>
@@ -1618,7 +1494,6 @@
         <w:rPr>
           <w:lang w:val="es-MX"/>
         </w:rPr>
-        <w:lastRenderedPageBreak/>
         <w:t xml:space="preserve">Los procesos </w:t>
       </w:r>
       <w:proofErr w:type="spellStart"/>

</xml_diff>